<commit_message>
Preenche indicação do anexo no relatório
</commit_message>
<xml_diff>
--- a/ECI_Equipe-TecInclui_A05_v02.docx
+++ b/ECI_Equipe-TecInclui_A05_v02.docx
@@ -1185,42 +1185,16 @@
         <w:tc>
           <w:tcPr/>
           <w:p>
-            <w:pPr>
-              <w:rPr/>
-            </w:pPr>
-            <w:r>
-              <w:rPr>
-                <w:sz w:val="20"/>
-                <w:szCs w:val="20"/>
-                <w:rtl w:val="0"/>
-              </w:rPr>
-              <w:t xml:space="preserve">Portal web TEAcesso com trilhas de orientação (“Acabei de receber o diagnóstico”, escola, terapias, direitos), diretório de serviços de Teresina e cartilhas com passo a passo disponíveis para baixar em PDF.</w:t>
-            </w:r>
-            <w:r>
-              <w:rPr>
-                <w:rtl w:val="0"/>
-              </w:rPr>
-            </w:r>
-          </w:p>
-        </w:tc>
-        <w:tc>
-          <w:tcPr/>
-          <w:p>
-            <w:pPr>
-              <w:rPr/>
-            </w:pPr>
-            <w:r>
-              <w:rPr>
-                <w:sz w:val="20"/>
-                <w:szCs w:val="20"/>
-                <w:rtl w:val="0"/>
-              </w:rPr>
-              <w:t xml:space="preserve">Centraliza as informações em um canal único, atualizável e fácil de compartilhar. As cartilhas para baixar permitem guardar, imprimir e enviar o conteúdo pelo WhatsApp.</w:t>
-            </w:r>
-            <w:r>
-              <w:rPr>
-                <w:rtl w:val="0"/>
-              </w:rPr>
+            <w:r>
+              <w:t>Portal web TEAcesso com trilhas de orientação, diretório inicial de serviços e cartilha “Caminho dos Cuidados TEA” para baixar em Word. A exportação em PDF e o compartilhamento por WhatsApp são possibilidades futuras, não funções entregues.</w:t>
+            </w:r>
+          </w:p>
+        </w:tc>
+        <w:tc>
+          <w:tcPr/>
+          <w:p>
+            <w:r>
+              <w:t>Reúne a navegação do protótipo e oferece um arquivo para consulta fora do site. Famílias podem avaliar a clareza e o acesso ao material; uso offline em PDF e compartilhamento ainda dependem de ajustes.</w:t>
             </w:r>
           </w:p>
         </w:tc>
@@ -2388,21 +2362,8 @@
         <w:tc>
           <w:tcPr/>
           <w:p>
-            <w:pPr>
-              <w:rPr/>
-            </w:pPr>
-            <w:r>
-              <w:rPr>
-                <w:sz w:val="20"/>
-                <w:szCs w:val="20"/>
-                <w:rtl w:val="0"/>
-              </w:rPr>
-              <w:t xml:space="preserve">Centraliza e mantém as informações atualizadas; as cartilhas para baixar ampliam o uso offline e o compartilhamento. Eficácia ainda não comprovada.</w:t>
-            </w:r>
-            <w:r>
-              <w:rPr>
-                <w:rtl w:val="0"/>
-              </w:rPr>
+            <w:r>
+              <w:t>O site organiza as informações e permite baixar a cartilha em Word. O acesso fora do site é possível após baixar o arquivo; PDF e compartilhamento direto por WhatsApp ainda não estão disponíveis. Benefício esperado, não medido.</w:t>
             </w:r>
           </w:p>
         </w:tc>
@@ -2754,25 +2715,49 @@
         <w:tc>
           <w:tcPr/>
           <w:p>
-            <w:pPr>
-              <w:rPr/>
-            </w:pPr>
-            <w:r>
-              <w:rPr>
-                <w:rFonts w:ascii="Arial Unicode MS" w:cs="Arial Unicode MS" w:eastAsia="Arial Unicode MS" w:hAnsi="Arial Unicode MS"/>
-                <w:i w:val="0"/>
-                <w:iCs w:val="0"/>
-                <w:sz w:val="20"/>
-                <w:szCs w:val="20"/>
-                <w:rtl w:val="0"/>
-              </w:rPr>
-              <w:t xml:space="preserve">Anexo pendente. Percurso previsto da amostra: Tela inicial → “Acabei de receber o diagnóstico” → Etapas (1. Terapias e acompanhamento • 2. Escola • 3. Direitos e benefícios) → Página da etapa com explicação curta → botões “Baixar cartilha (PDF)” e “Compartilhar no WhatsApp” → Diretório de serviços (dados a confirmar).</w:t>
-            </w:r>
-            <w:r>
-              <w:rPr>
-                <w:rtl w:val="0"/>
-              </w:rPr>
-            </w:r>
+            <w:r/>
+            <w:r>
+              <w:rPr>
+                <w:b/>
+              </w:rPr>
+              <w:t>ANEXO DA REPRESENTAÇÃO — Cartilha Caminho dos Cuidados TEA, versão 0.3</w:t>
+            </w:r>
+          </w:p>
+          <w:p>
+            <w:r>
+              <w:t>Arquivo entregue em Word (.docx), com orientações em cinco passos, direitos e referências de serviços. O site oferece o download deste arquivo; o PDF e o compartilhamento por WhatsApp ainda não foram implementados.</w:t>
+            </w:r>
+          </w:p>
+          <w:p>
+            <w:r>
+              <w:t>Percurso para a pessoa testar: abrir o site → selecionar “Cartilhas” → ler o resumo e o aviso de validação → baixar a cartilha. A página Serviços/Contatos também reúne as referências de UBS, CRAS, CeTEA-PI, SEID, Defensoria Pública e SEMEC, marcadas como pendentes de confirmação.</w:t>
+            </w:r>
+          </w:p>
+          <w:p>
+            <w:r>
+              <w:t xml:space="preserve">Acessos: </w:t>
+            </w:r>
+            <w:hyperlink r:id="rId10">
+              <w:r>
+                <w:rPr>
+                  <w:color w:val="0563C1"/>
+                  <w:u w:val="single"/>
+                </w:rPr>
+                <w:t>abrir a página Cartilhas</w:t>
+              </w:r>
+            </w:hyperlink>
+            <w:r>
+              <w:t xml:space="preserve">  |  </w:t>
+            </w:r>
+            <w:hyperlink r:id="rId11">
+              <w:r>
+                <w:rPr>
+                  <w:color w:val="0563C1"/>
+                  <w:u w:val="single"/>
+                </w:rPr>
+                <w:t>baixar a cartilha (.docx)</w:t>
+              </w:r>
+            </w:hyperlink>
           </w:p>
         </w:tc>
       </w:tr>

</xml_diff>

<commit_message>
✨ feat: integra PDF da cartilha e simplifica serviços e contatos
</commit_message>
<xml_diff>
--- a/ECI_Equipe-TecInclui_A05_v02.docx
+++ b/ECI_Equipe-TecInclui_A05_v02.docx
@@ -1186,15 +1186,15 @@
           <w:tcPr/>
           <w:p>
             <w:r>
-              <w:t>Portal web TEAcesso com trilhas de orientação, diretório inicial de serviços e cartilha “Caminho dos Cuidados TEA” para baixar em Word. A exportação em PDF e o compartilhamento por WhatsApp são possibilidades futuras, não funções entregues.</w:t>
-            </w:r>
-          </w:p>
-        </w:tc>
-        <w:tc>
-          <w:tcPr/>
-          <w:p>
-            <w:r>
-              <w:t>Reúne a navegação do protótipo e oferece um arquivo para consulta fora do site. Famílias podem avaliar a clareza e o acesso ao material; uso offline em PDF e compartilhamento ainda dependem de ajustes.</w:t>
+              <w:t>Portal web TEAcesso com trilhas de orientação, diretório inicial de serviços e a cartilha “Caminho dos Cuidados TEA” disponível para baixar em PDF.</w:t>
+            </w:r>
+          </w:p>
+        </w:tc>
+        <w:tc>
+          <w:tcPr/>
+          <w:p>
+            <w:r>
+              <w:t>Reúne a navegação do protótipo e oferece um arquivo PDF para consulta fora do site e impressão. Famílias podem avaliar a clareza e o acesso ao material; benefício ainda a validar.</w:t>
             </w:r>
           </w:p>
         </w:tc>
@@ -2363,7 +2363,7 @@
           <w:tcPr/>
           <w:p>
             <w:r>
-              <w:t>O site organiza as informações e permite baixar a cartilha em Word. O acesso fora do site é possível após baixar o arquivo; PDF e compartilhamento direto por WhatsApp ainda não estão disponíveis. Benefício esperado, não medido.</w:t>
+              <w:t>O site organiza as informações e permite baixar a cartilha em PDF para consulta e impressão. O compartilhamento direto pelo site não está implementado. Benefício esperado, não medido.</w:t>
             </w:r>
           </w:p>
         </w:tc>
@@ -2490,7 +2490,7 @@
         <w:rPr/>
       </w:pPr>
       <w:r>
-        <w:t>Por que faz sentido diante dos achados e da comparação: É a alternativa que responde aos três achados ao mesmo tempo (canal único, orientação por etapas e trilhas por necessidade) e incorpora o ponto forte da alternativa B: a cartilha pode ser baixada e consultada fora do site. O arquivo recebido está em Word; uma versão PDF acessível e pronta para compartilhamento depende de exportação e revisão. Também é a alternativa mais viável para a equipe neste semestre.</w:t>
+        <w:t>Por que faz sentido diante dos achados e da comparação: É a alternativa que responde aos três achados ao mesmo tempo (canal único, orientação por etapas e trilhas por necessidade) e incorpora o ponto forte da alternativa B: a cartilha está disponível em PDF para baixar, consultar e imprimir. Também é a alternativa mais viável para a equipe neste semestre.</w:t>
       </w:r>
     </w:p>
     <w:p>
@@ -2606,7 +2606,7 @@
         <w:rPr/>
       </w:pPr>
       <w:r>
-        <w:t>Tipo de representação: Cartilha visual “Caminho dos Cuidados TEA”, versão 0.3, construída em duas páginas no Word e integrada à seção Cartilhas do site. O protótipo apresenta os temas e permite baixar o arquivo recebido em formato .docx.</w:t>
+        <w:t>Tipo de representação: Cartilha visual “Caminho dos Cuidados TEA”, versão 0.3, integrada à seção Cartilhas do site e disponível para download em PDF.</w:t>
       </w:r>
     </w:p>
     <w:p>
@@ -2623,7 +2623,7 @@
         <w:rPr/>
       </w:pPr>
       <w:r>
-        <w:t>O site TEAcesso é um protótipo navegável para apresentar a proposta e apoiar a consulta à cartilha. A página Cartilhas oferece o arquivo Word recebido e informa que as referências locais precisam de validação. Esta representação não depende de backend, autenticação ou banco de dados.</w:t>
+        <w:t>O site TEAcesso é um protótipo navegável para apresentar a proposta e apoiar a consulta à cartilha. A página Cartilhas oferece o PDF para download e informa que as referências locais precisam de validação. Esta representação não depende de backend, autenticação ou banco de dados.</w:t>
       </w:r>
     </w:p>
     <w:p>
@@ -2669,7 +2669,7 @@
         <w:rPr/>
       </w:pPr>
       <w:r>
-        <w:t xml:space="preserve">Anexo da representação: Cartilha “Caminho dos Cuidados TEA”, versão 0.3, em Word (.docx), disponível na pasta assets/cartilhas do projeto e para download na página Cartilhas do protótipo público. A seção Serviços e Contatos apresenta os seis pontos de apoio descritos no material, com os dados marcados como pendentes de confirmação. Acesse: </w:t>
+        <w:t xml:space="preserve">Anexo da representação: Cartilha “Caminho dos Cuidados TEA”, versão 0.3, em PDF, incluída na pasta assets/cartilhas e disponível na página Cartilhas do protótipo público. A seção Serviços e Contatos apresenta UBS, CRAS, CeTEA-PI, SEID, Defensoria Pública e SEMEC. Acesse: </w:t>
       </w:r>
       <w:hyperlink r:id="rId10">
         <w:r>
@@ -2677,7 +2677,19 @@
             <w:color w:val="0563C1"/>
             <w:u w:val="single"/>
           </w:rPr>
-          <w:t>página pública da cartilha</w:t>
+          <w:t>página Cartilhas</w:t>
+        </w:r>
+      </w:hyperlink>
+      <w:r>
+        <w:t xml:space="preserve">  |  </w:t>
+      </w:r>
+      <w:hyperlink r:id="rId12">
+        <w:r>
+          <w:rPr>
+            <w:color w:val="0563C1"/>
+            <w:u w:val="single"/>
+          </w:rPr>
+          <w:t>baixar cartilha PDF</w:t>
         </w:r>
       </w:hyperlink>
     </w:p>
@@ -2720,17 +2732,17 @@
               <w:rPr>
                 <w:b/>
               </w:rPr>
-              <w:t>ANEXO DA REPRESENTAÇÃO — Cartilha Caminho dos Cuidados TEA, versão 0.3</w:t>
-            </w:r>
-          </w:p>
-          <w:p>
-            <w:r>
-              <w:t>Arquivo entregue em Word (.docx), com orientações em cinco passos, direitos e referências de serviços. O site oferece o download deste arquivo; o PDF e o compartilhamento por WhatsApp ainda não foram implementados.</w:t>
-            </w:r>
-          </w:p>
-          <w:p>
-            <w:r>
-              <w:t>Percurso para a pessoa testar: abrir o site → selecionar “Cartilhas” → ler o resumo e o aviso de validação → baixar a cartilha. A página Serviços/Contatos também reúne as referências de UBS, CRAS, CeTEA-PI, SEID, Defensoria Pública e SEMEC, marcadas como pendentes de confirmação.</w:t>
+              <w:t>ANEXO DA REPRESENTAÇÃO — Cartilha Caminho dos Cuidados TEA, versão 0.3 (PDF)</w:t>
+            </w:r>
+          </w:p>
+          <w:p>
+            <w:r>
+              <w:t>O PDF está integrado ao site e pode ser baixado para consulta e impressão.</w:t>
+            </w:r>
+          </w:p>
+          <w:p>
+            <w:r>
+              <w:t>Percurso para teste: abrir o site → selecionar “Cartilhas” → ler o resumo e o aviso de validação → baixar o PDF. A página Serviços/Contatos apresenta os serviços de saúde, educação, assistência social e orientação sobre direitos.</w:t>
             </w:r>
           </w:p>
           <w:p>
@@ -2749,13 +2761,13 @@
             <w:r>
               <w:t xml:space="preserve">  |  </w:t>
             </w:r>
-            <w:hyperlink r:id="rId11">
+            <w:hyperlink r:id="rId12">
               <w:r>
                 <w:rPr>
                   <w:color w:val="0563C1"/>
                   <w:u w:val="single"/>
                 </w:rPr>
-                <w:t>baixar a cartilha (.docx)</w:t>
+                <w:t>baixar a cartilha PDF</w:t>
               </w:r>
             </w:hyperlink>
           </w:p>
@@ -3217,7 +3229,7 @@
           <w:tcPr/>
           <w:p>
             <w:r>
-              <w:t>Cartilha v0.3 em Word, anexada ao site</w:t>
+              <w:t>Cartilha v0.3 em PDF, integrada ao site</w:t>
             </w:r>
           </w:p>
         </w:tc>

</xml_diff>